<commit_message>
Validación del AG con los parámetros calibrados en los documentos
Se repitieron las corridas del AG de la validación con el modelo final
(parada tras 100 generaciones sin mejora). Las mejores soluciones y las
conclusiones no cambian; se actualizan en ambos documentos el promedio y
las réplicas de I6, el promedio de I9 y los tiempos, y se aclara que la
validación usa los parámetros calibrados.

Co-Authored-By: Claude Opus 5.5 <noreply@anthropic.com>
Claude-Session: https://claude.ai/code/session_01TVPKkpnk5SghcUD46f5dXj
</commit_message>
<xml_diff>
--- a/docs/Trabajo_de_Grado_con_Fase_2.docx
+++ b/docs/Trabajo_de_Grado_con_Fase_2.docx
@@ -24986,7 +24986,7 @@
         </m:sSub>
       </m:oMath>
       <w:r>
-        <w:t>. Sobre las mismas instancias se corrió el algoritmo genético, sin modificaciones, con 10 semillas distintas. La Tabla 15 presenta los resultados.</w:t>
+        <w:t>. Sobre las mismas instancias se corrió el algoritmo genético, con los parámetros calibrados en la sección 4.2.6, con 10 semillas distintas. La Tabla 15 presenta los resultados.</w:t>
       </w:r>
     </w:p>
     <w:p>
@@ -25617,7 +25617,7 @@
               <w:rPr>
                 <w:sz w:val="16"/>
               </w:rPr>
-              <w:t>0,9</w:t>
+              <w:t>3,4</w:t>
             </w:r>
           </w:p>
         </w:tc>
@@ -25781,7 +25781,7 @@
               <w:rPr>
                 <w:sz w:val="16"/>
               </w:rPr>
-              <w:t>1,1</w:t>
+              <w:t>3,7</w:t>
             </w:r>
           </w:p>
         </w:tc>
@@ -25945,7 +25945,7 @@
               <w:rPr>
                 <w:sz w:val="16"/>
               </w:rPr>
-              <w:t>1,4</w:t>
+              <w:t>4,5</w:t>
             </w:r>
           </w:p>
         </w:tc>
@@ -26109,7 +26109,7 @@
               <w:rPr>
                 <w:sz w:val="16"/>
               </w:rPr>
-              <w:t>1,3</w:t>
+              <w:t>4,3</w:t>
             </w:r>
           </w:p>
         </w:tc>
@@ -26273,7 +26273,7 @@
               <w:rPr>
                 <w:sz w:val="16"/>
               </w:rPr>
-              <w:t>2,3</w:t>
+              <w:t>6,9</w:t>
             </w:r>
           </w:p>
         </w:tc>
@@ -26401,7 +26401,7 @@
               <w:rPr>
                 <w:sz w:val="16"/>
               </w:rPr>
-              <w:t>6,080</w:t>
+              <w:t>6,020</w:t>
             </w:r>
           </w:p>
         </w:tc>
@@ -26419,7 +26419,7 @@
               <w:rPr>
                 <w:sz w:val="16"/>
               </w:rPr>
-              <w:t>7/10</w:t>
+              <w:t>8/10</w:t>
             </w:r>
           </w:p>
         </w:tc>
@@ -26437,7 +26437,7 @@
               <w:rPr>
                 <w:sz w:val="16"/>
               </w:rPr>
-              <w:t>2,1</w:t>
+              <w:t>6,6</w:t>
             </w:r>
           </w:p>
         </w:tc>
@@ -26601,7 +26601,7 @@
               <w:rPr>
                 <w:sz w:val="16"/>
               </w:rPr>
-              <w:t>2,9</w:t>
+              <w:t>7,9</w:t>
             </w:r>
           </w:p>
         </w:tc>
@@ -26765,7 +26765,7 @@
               <w:rPr>
                 <w:sz w:val="16"/>
               </w:rPr>
-              <w:t>3,8</w:t>
+              <w:t>9,9</w:t>
             </w:r>
           </w:p>
         </w:tc>
@@ -26886,7 +26886,7 @@
               <w:rPr>
                 <w:sz w:val="16"/>
               </w:rPr>
-              <w:t>1,468</w:t>
+              <w:t>1,457</w:t>
             </w:r>
           </w:p>
         </w:tc>
@@ -26920,7 +26920,7 @@
               <w:rPr>
                 <w:sz w:val="16"/>
               </w:rPr>
-              <w:t>4,0</w:t>
+              <w:t>11,3</w:t>
             </w:r>
           </w:p>
         </w:tc>
@@ -27141,7 +27141,7 @@
         <w:t>El método exacto no escala, mientras que el algoritmo genético sí.</w:t>
       </w:r>
       <w:r>
-        <w:t xml:space="preserve"> F1 demostró la optimalidad solo hasta 6 sublotes y no encontró soluciones factibles con 12 y 15 sublotes en 10 minutos. En las instancias medianas, el algoritmo igualó o superó en menos de 4 segundos la mejor solución que el solver obtuvo en 20 minutos; en I9, por ejemplo, obtuvo 1,214 h frente a 8,077 h. La instancia real, con 100 sublotes y más de 363.000 variables binarias, está muy por encima de lo que el método exacto puede resolver.</w:t>
+        <w:t xml:space="preserve"> F1 demostró la optimalidad solo hasta 6 sublotes y no encontró soluciones factibles con 12 y 15 sublotes en 10 minutos. En las instancias medianas, el algoritmo igualó o superó en menos de 12 segundos la mejor solución que el solver obtuvo en 20 minutos; en I9, por ejemplo, obtuvo 1,214 h frente a 8,077 h. La instancia real, con 100 sublotes y más de 363.000 variables binarias, está muy por encima de lo que el método exacto puede resolver.</w:t>
       </w:r>
     </w:p>
     <w:p>

</xml_diff>